<commit_message>
feat(localization): implement multi-language support and translate services page
</commit_message>
<xml_diff>
--- a/docs/Account.docx
+++ b/docs/Account.docx
@@ -149,18 +149,7 @@
           <w:szCs w:val="24"/>
           <w:lang w:eastAsia="pt-PT"/>
         </w:rPr>
-        <w:t>Tenho o prazer de i</w:t>
-      </w:r>
-      <w:bookmarkStart w:id="0" w:name="_GoBack"/>
-      <w:bookmarkEnd w:id="0"/>
-      <w:r>
-        <w:rPr>
-          <w:rFonts w:ascii="Times New Roman" w:eastAsia="Times New Roman" w:hAnsi="Times New Roman" w:cs="Times New Roman"/>
-          <w:sz w:val="24"/>
-          <w:szCs w:val="24"/>
-          <w:lang w:eastAsia="pt-PT"/>
-        </w:rPr>
-        <w:t xml:space="preserve">nformar que as contas de </w:t>
+        <w:t xml:space="preserve">Tenho o prazer de informar que as contas de </w:t>
       </w:r>
       <w:proofErr w:type="gramStart"/>
       <w:r>
@@ -1040,6 +1029,257 @@
     </w:p>
     <w:p>
       <w:pPr>
+        <w:spacing w:before="100" w:beforeAutospacing="1" w:after="100" w:afterAutospacing="1" w:line="240" w:lineRule="auto"/>
+        <w:rPr>
+          <w:rFonts w:ascii="Times New Roman" w:eastAsia="Times New Roman" w:hAnsi="Times New Roman" w:cs="Times New Roman"/>
+          <w:sz w:val="24"/>
+          <w:szCs w:val="24"/>
+          <w:lang w:eastAsia="pt-PT"/>
+        </w:rPr>
+      </w:pPr>
+      <w:r>
+        <w:rPr>
+          <w:rFonts w:ascii="Times New Roman" w:eastAsia="Times New Roman" w:hAnsi="Times New Roman" w:cs="Times New Roman"/>
+          <w:b/>
+          <w:bCs/>
+          <w:sz w:val="24"/>
+          <w:szCs w:val="24"/>
+          <w:lang w:eastAsia="pt-PT"/>
+        </w:rPr>
+        <w:t>5.</w:t>
+      </w:r>
+      <w:r>
+        <w:rPr>
+          <w:rFonts w:ascii="Times New Roman" w:eastAsia="Times New Roman" w:hAnsi="Times New Roman" w:cs="Times New Roman"/>
+          <w:sz w:val="24"/>
+          <w:szCs w:val="24"/>
+          <w:lang w:eastAsia="pt-PT"/>
+        </w:rPr>
+        <w:t xml:space="preserve"> </w:t>
+      </w:r>
+      <w:r>
+        <w:rPr>
+          <w:rFonts w:ascii="Times New Roman" w:eastAsia="Times New Roman" w:hAnsi="Times New Roman" w:cs="Times New Roman"/>
+          <w:b/>
+          <w:sz w:val="24"/>
+          <w:szCs w:val="24"/>
+          <w:lang w:eastAsia="pt-PT"/>
+        </w:rPr>
+        <w:t>Utilizador</w:t>
+      </w:r>
+      <w:r>
+        <w:rPr>
+          <w:rFonts w:ascii="Times New Roman" w:eastAsia="Times New Roman" w:hAnsi="Times New Roman" w:cs="Times New Roman"/>
+          <w:sz w:val="24"/>
+          <w:szCs w:val="24"/>
+          <w:lang w:eastAsia="pt-PT"/>
+        </w:rPr>
+        <w:t xml:space="preserve">: </w:t>
+      </w:r>
+      <w:r>
+        <w:rPr>
+          <w:rFonts w:ascii="Times New Roman" w:eastAsia="Times New Roman" w:hAnsi="Times New Roman" w:cs="Times New Roman"/>
+          <w:b/>
+          <w:sz w:val="24"/>
+          <w:szCs w:val="24"/>
+          <w:lang w:eastAsia="pt-PT"/>
+        </w:rPr>
+        <w:t>Domingos Azeite Domingos Joia</w:t>
+      </w:r>
+    </w:p>
+    <w:p>
+      <w:pPr>
+        <w:numPr>
+          <w:ilvl w:val="0"/>
+          <w:numId w:val="4"/>
+        </w:numPr>
+        <w:spacing w:before="100" w:beforeAutospacing="1" w:after="100" w:afterAutospacing="1" w:line="240" w:lineRule="auto"/>
+        <w:rPr>
+          <w:rFonts w:ascii="Times New Roman" w:eastAsia="Times New Roman" w:hAnsi="Times New Roman" w:cs="Times New Roman"/>
+          <w:sz w:val="24"/>
+          <w:szCs w:val="24"/>
+          <w:lang w:val="en-US" w:eastAsia="pt-PT"/>
+        </w:rPr>
+      </w:pPr>
+      <w:bookmarkStart w:id="0" w:name="_GoBack"/>
+      <w:r>
+        <w:rPr>
+          <w:rFonts w:ascii="Times New Roman" w:eastAsia="Times New Roman" w:hAnsi="Times New Roman" w:cs="Times New Roman"/>
+          <w:b/>
+          <w:bCs/>
+          <w:sz w:val="24"/>
+          <w:szCs w:val="24"/>
+          <w:lang w:val="en-US" w:eastAsia="pt-PT"/>
+        </w:rPr>
+        <w:t>Email:</w:t>
+      </w:r>
+      <w:r>
+        <w:rPr>
+          <w:rFonts w:ascii="Times New Roman" w:eastAsia="Times New Roman" w:hAnsi="Times New Roman" w:cs="Times New Roman"/>
+          <w:sz w:val="24"/>
+          <w:szCs w:val="24"/>
+          <w:lang w:val="en-US" w:eastAsia="pt-PT"/>
+        </w:rPr>
+        <w:t xml:space="preserve"> </w:t>
+      </w:r>
+      <w:hyperlink r:id="rId9" w:history="1">
+        <w:r>
+          <w:rPr>
+            <w:rFonts w:ascii="Times New Roman" w:eastAsia="Times New Roman" w:hAnsi="Times New Roman" w:cs="Times New Roman"/>
+            <w:color w:val="0000FF"/>
+            <w:sz w:val="24"/>
+            <w:szCs w:val="24"/>
+            <w:u w:val="single"/>
+            <w:lang w:val="en-US" w:eastAsia="pt-PT"/>
+          </w:rPr>
+          <w:t>domingos.ajoia@hgconsultingengineering.com</w:t>
+        </w:r>
+      </w:hyperlink>
+    </w:p>
+    <w:p>
+      <w:pPr>
+        <w:numPr>
+          <w:ilvl w:val="0"/>
+          <w:numId w:val="4"/>
+        </w:numPr>
+        <w:spacing w:before="100" w:beforeAutospacing="1" w:after="100" w:afterAutospacing="1" w:line="240" w:lineRule="auto"/>
+        <w:rPr>
+          <w:rFonts w:ascii="Times New Roman" w:eastAsia="Times New Roman" w:hAnsi="Times New Roman" w:cs="Times New Roman"/>
+          <w:sz w:val="24"/>
+          <w:szCs w:val="24"/>
+          <w:lang w:eastAsia="pt-PT"/>
+        </w:rPr>
+      </w:pPr>
+      <w:r>
+        <w:rPr>
+          <w:rFonts w:ascii="Times New Roman" w:eastAsia="Times New Roman" w:hAnsi="Times New Roman" w:cs="Times New Roman"/>
+          <w:b/>
+          <w:bCs/>
+          <w:sz w:val="24"/>
+          <w:szCs w:val="24"/>
+          <w:lang w:eastAsia="pt-PT"/>
+        </w:rPr>
+        <w:t>Senha temporária:</w:t>
+      </w:r>
+      <w:r>
+        <w:rPr>
+          <w:rFonts w:ascii="Times New Roman" w:eastAsia="Times New Roman" w:hAnsi="Times New Roman" w:cs="Times New Roman"/>
+          <w:sz w:val="24"/>
+          <w:szCs w:val="24"/>
+          <w:lang w:eastAsia="pt-PT"/>
+        </w:rPr>
+        <w:t xml:space="preserve"> </w:t>
+      </w:r>
+      <w:r>
+        <w:rPr>
+          <w:rFonts w:ascii="Courier New" w:eastAsia="Times New Roman" w:hAnsi="Courier New" w:cs="Courier New"/>
+          <w:sz w:val="20"/>
+          <w:szCs w:val="20"/>
+          <w:lang w:eastAsia="pt-PT"/>
+        </w:rPr>
+        <w:t>HGCE_</w:t>
+      </w:r>
+      <w:r>
+        <w:rPr>
+          <w:rFonts w:ascii="Courier New" w:eastAsia="Times New Roman" w:hAnsi="Courier New" w:cs="Courier New"/>
+          <w:sz w:val="20"/>
+          <w:szCs w:val="20"/>
+          <w:lang w:eastAsia="pt-PT"/>
+        </w:rPr>
+        <w:t>Domingos2026</w:t>
+      </w:r>
+    </w:p>
+    <w:p>
+      <w:pPr>
+        <w:numPr>
+          <w:ilvl w:val="0"/>
+          <w:numId w:val="1"/>
+        </w:numPr>
+        <w:spacing w:before="100" w:beforeAutospacing="1" w:after="100" w:afterAutospacing="1" w:line="240" w:lineRule="auto"/>
+        <w:rPr>
+          <w:rFonts w:ascii="Times New Roman" w:eastAsia="Times New Roman" w:hAnsi="Times New Roman" w:cs="Times New Roman"/>
+          <w:sz w:val="24"/>
+          <w:szCs w:val="24"/>
+          <w:lang w:eastAsia="pt-PT"/>
+        </w:rPr>
+      </w:pPr>
+      <w:r>
+        <w:rPr>
+          <w:rFonts w:ascii="Times New Roman" w:eastAsia="Times New Roman" w:hAnsi="Times New Roman" w:cs="Times New Roman"/>
+          <w:b/>
+          <w:bCs/>
+          <w:sz w:val="24"/>
+          <w:szCs w:val="24"/>
+          <w:lang w:eastAsia="pt-PT"/>
+        </w:rPr>
+        <w:t>Finalidade:</w:t>
+      </w:r>
+      <w:r>
+        <w:rPr>
+          <w:rFonts w:ascii="Times New Roman" w:eastAsia="Times New Roman" w:hAnsi="Times New Roman" w:cs="Times New Roman"/>
+          <w:sz w:val="24"/>
+          <w:szCs w:val="24"/>
+          <w:lang w:eastAsia="pt-PT"/>
+        </w:rPr>
+        <w:t xml:space="preserve"> </w:t>
+      </w:r>
+      <w:r>
+        <w:rPr>
+          <w:rFonts w:ascii="Times New Roman" w:eastAsia="Times New Roman" w:hAnsi="Times New Roman" w:cs="Times New Roman"/>
+          <w:sz w:val="24"/>
+          <w:szCs w:val="24"/>
+          <w:lang w:eastAsia="pt-PT"/>
+        </w:rPr>
+        <w:t xml:space="preserve">Uso pessoal e profissional exclusivo do </w:t>
+      </w:r>
+      <w:r>
+        <w:rPr>
+          <w:rFonts w:ascii="Times New Roman" w:eastAsia="Times New Roman" w:hAnsi="Times New Roman" w:cs="Times New Roman"/>
+          <w:sz w:val="24"/>
+          <w:szCs w:val="24"/>
+          <w:lang w:eastAsia="pt-PT"/>
+        </w:rPr>
+        <w:t>Domingos</w:t>
+      </w:r>
+      <w:proofErr w:type="gramStart"/>
+      <w:r>
+        <w:rPr>
+          <w:rFonts w:ascii="Times New Roman" w:eastAsia="Times New Roman" w:hAnsi="Times New Roman" w:cs="Times New Roman"/>
+          <w:sz w:val="24"/>
+          <w:szCs w:val="24"/>
+          <w:lang w:eastAsia="pt-PT"/>
+        </w:rPr>
+        <w:t>,</w:t>
+      </w:r>
+      <w:proofErr w:type="gramEnd"/>
+      <w:r>
+        <w:rPr>
+          <w:rFonts w:ascii="Times New Roman" w:eastAsia="Times New Roman" w:hAnsi="Times New Roman" w:cs="Times New Roman"/>
+          <w:sz w:val="24"/>
+          <w:szCs w:val="24"/>
+          <w:lang w:eastAsia="pt-PT"/>
+        </w:rPr>
+        <w:t xml:space="preserve"> para comunicações internas e externas com clientes, parceiros e instituições.</w:t>
+      </w:r>
+    </w:p>
+    <w:bookmarkEnd w:id="0"/>
+    <w:p>
+      <w:pPr>
+        <w:numPr>
+          <w:ilvl w:val="0"/>
+          <w:numId w:val="4"/>
+        </w:numPr>
+        <w:spacing w:before="100" w:beforeAutospacing="1" w:after="100" w:afterAutospacing="1" w:line="240" w:lineRule="auto"/>
+        <w:rPr>
+          <w:rFonts w:ascii="Times New Roman" w:eastAsia="Times New Roman" w:hAnsi="Times New Roman" w:cs="Times New Roman"/>
+          <w:sz w:val="24"/>
+          <w:szCs w:val="24"/>
+          <w:lang w:eastAsia="pt-PT"/>
+        </w:rPr>
+      </w:pPr>
+    </w:p>
+    <w:p>
+      <w:pPr>
         <w:spacing w:after="0" w:line="240" w:lineRule="auto"/>
         <w:rPr>
           <w:rFonts w:ascii="Times New Roman" w:eastAsia="Times New Roman" w:hAnsi="Times New Roman" w:cs="Times New Roman"/>
@@ -1122,7 +1362,6 @@
           <w:szCs w:val="24"/>
           <w:lang w:eastAsia="pt-PT"/>
         </w:rPr>
-        <w:lastRenderedPageBreak/>
         <w:t>Caso necessite de apoio na configuração, sincronização com dispositivos ou tenha qualquer dúvida, estou inteiramente à disposição para ajudar.</w:t>
       </w:r>
     </w:p>
@@ -1163,21 +1402,8 @@
           <w:szCs w:val="24"/>
           <w:lang w:eastAsia="pt-PT"/>
         </w:rPr>
-        <w:t xml:space="preserve">Túlio Benedito </w:t>
-      </w:r>
-      <w:proofErr w:type="spellStart"/>
-      <w:r>
-        <w:rPr>
-          <w:rFonts w:ascii="Times New Roman" w:eastAsia="Times New Roman" w:hAnsi="Times New Roman" w:cs="Times New Roman"/>
-          <w:b/>
-          <w:bCs/>
-          <w:sz w:val="24"/>
-          <w:szCs w:val="24"/>
-          <w:lang w:eastAsia="pt-PT"/>
-        </w:rPr>
-        <w:t>Nhantumbo</w:t>
-      </w:r>
-      <w:proofErr w:type="spellEnd"/>
+        <w:t>Túlio Benedito Nhantumbo</w:t>
+      </w:r>
       <w:r>
         <w:rPr>
           <w:rFonts w:ascii="Times New Roman" w:eastAsia="Times New Roman" w:hAnsi="Times New Roman" w:cs="Times New Roman"/>
@@ -2227,6 +2453,7 @@
   <w:style w:type="paragraph" w:default="1" w:styleId="Normal">
     <w:name w:val="Normal"/>
     <w:qFormat/>
+    <w:rsid w:val="0018215B"/>
   </w:style>
   <w:style w:type="paragraph" w:styleId="Heading3">
     <w:name w:val="heading 3"/>

</xml_diff>